<commit_message>
Updates to V's article formatting
</commit_message>
<xml_diff>
--- a/assets/Carbon Taxes A Libertarians Secret Love.docx
+++ b/assets/Carbon Taxes A Libertarians Secret Love.docx
@@ -150,6 +150,16 @@
     </w:p>
     <w:p>
       <w:pPr>
+        <w:pStyle w:val="Heading2"/>
+        <w:spacing w:after="80"/>
+        <w:ind w:right="600"/>
+      </w:pPr>
+      <w:r>
+        <w:t>Meet Lucifer</w:t>
+      </w:r>
+    </w:p>
+    <w:p>
+      <w:pPr>
         <w:spacing w:before="240" w:after="240"/>
         <w:ind w:right="600"/>
       </w:pPr>
@@ -210,7 +220,11 @@
       </w:r>
       <w:proofErr w:type="spellEnd"/>
       <w:r>
-        <w:t xml:space="preserve"> had joined the government protection ring by arming them with more data and information to harass citizens and push the modern nation-building project that is underwritten by hardworking innovators such as himself.</w:t>
+        <w:t xml:space="preserve"> had joined the government protection ring by arming them with more </w:t>
+      </w:r>
+      <w:r>
+        <w:lastRenderedPageBreak/>
+        <w:t>data and information to harass citizens and push the modern nation-building project that is underwritten by hardworking innovators such as himself.</w:t>
       </w:r>
     </w:p>
     <w:p>
@@ -219,7 +233,6 @@
         <w:ind w:right="600"/>
       </w:pPr>
       <w:r>
-        <w:lastRenderedPageBreak/>
         <w:t xml:space="preserve">Sidestepping this </w:t>
       </w:r>
       <w:proofErr w:type="spellStart"/>
@@ -301,12 +314,12 @@
         <w:t xml:space="preserve"> (</w:t>
       </w:r>
       <w:r>
-        <w:rPr>
-          <w:color w:val="FF0000"/>
-        </w:rPr>
         <w:t>and yours truly</w:t>
       </w:r>
       <w:r>
+        <w:t xml:space="preserve"> in red</w:t>
+      </w:r>
+      <w:r>
         <w:t xml:space="preserve">) with a </w:t>
       </w:r>
       <w:proofErr w:type="spellStart"/>
@@ -338,438 +351,414 @@
     </w:p>
     <w:p>
       <w:pPr>
+        <w:rPr>
+          <w:i/>
+          <w:iCs/>
+        </w:rPr>
+      </w:pPr>
+      <w:r>
+        <w:rPr>
+          <w:i/>
+          <w:iCs/>
+        </w:rPr>
+        <w:t xml:space="preserve">“Main </w:t>
+      </w:r>
+      <w:proofErr w:type="spellStart"/>
+      <w:r>
+        <w:rPr>
+          <w:i/>
+          <w:iCs/>
+        </w:rPr>
+        <w:t>zindagi</w:t>
+      </w:r>
+      <w:proofErr w:type="spellEnd"/>
+      <w:r>
+        <w:rPr>
+          <w:i/>
+          <w:iCs/>
+        </w:rPr>
+        <w:t xml:space="preserve"> ka </w:t>
+      </w:r>
+      <w:proofErr w:type="spellStart"/>
+      <w:r>
+        <w:rPr>
+          <w:i/>
+          <w:iCs/>
+        </w:rPr>
+        <w:t>saath</w:t>
+      </w:r>
+      <w:proofErr w:type="spellEnd"/>
+      <w:r>
+        <w:rPr>
+          <w:i/>
+          <w:iCs/>
+        </w:rPr>
+        <w:t xml:space="preserve"> </w:t>
+      </w:r>
+      <w:proofErr w:type="spellStart"/>
+      <w:r>
+        <w:rPr>
+          <w:i/>
+          <w:iCs/>
+        </w:rPr>
+        <w:t>nibhata</w:t>
+      </w:r>
+      <w:proofErr w:type="spellEnd"/>
+      <w:r>
+        <w:rPr>
+          <w:i/>
+          <w:iCs/>
+        </w:rPr>
+        <w:t xml:space="preserve"> </w:t>
+      </w:r>
+      <w:proofErr w:type="spellStart"/>
+      <w:r>
+        <w:rPr>
+          <w:i/>
+          <w:iCs/>
+        </w:rPr>
+        <w:t>chala</w:t>
+      </w:r>
+      <w:proofErr w:type="spellEnd"/>
+      <w:r>
+        <w:rPr>
+          <w:i/>
+          <w:iCs/>
+        </w:rPr>
+        <w:t xml:space="preserve"> </w:t>
+      </w:r>
+      <w:proofErr w:type="spellStart"/>
+      <w:r>
+        <w:rPr>
+          <w:i/>
+          <w:iCs/>
+        </w:rPr>
+        <w:t>gaya</w:t>
+      </w:r>
+      <w:proofErr w:type="spellEnd"/>
+      <w:r>
+        <w:rPr>
+          <w:i/>
+          <w:iCs/>
+        </w:rPr>
+        <w:t xml:space="preserve">, </w:t>
+      </w:r>
+    </w:p>
+    <w:p>
+      <w:pPr>
+        <w:rPr>
+          <w:i/>
+          <w:iCs/>
+        </w:rPr>
+      </w:pPr>
+      <w:r>
+        <w:rPr>
+          <w:i/>
+          <w:iCs/>
+        </w:rPr>
+        <w:t xml:space="preserve">Har </w:t>
+      </w:r>
+      <w:proofErr w:type="spellStart"/>
+      <w:r>
+        <w:rPr>
+          <w:i/>
+          <w:iCs/>
+        </w:rPr>
+        <w:t>fikr</w:t>
+      </w:r>
+      <w:proofErr w:type="spellEnd"/>
+      <w:r>
+        <w:rPr>
+          <w:i/>
+          <w:iCs/>
+        </w:rPr>
+        <w:t xml:space="preserve"> ko </w:t>
+      </w:r>
+      <w:proofErr w:type="spellStart"/>
+      <w:r>
+        <w:rPr>
+          <w:i/>
+          <w:iCs/>
+        </w:rPr>
+        <w:t>dhuen</w:t>
+      </w:r>
+      <w:proofErr w:type="spellEnd"/>
+      <w:r>
+        <w:rPr>
+          <w:i/>
+          <w:iCs/>
+        </w:rPr>
+        <w:t xml:space="preserve"> </w:t>
+      </w:r>
+      <w:proofErr w:type="spellStart"/>
+      <w:r>
+        <w:rPr>
+          <w:i/>
+          <w:iCs/>
+        </w:rPr>
+        <w:t>mein</w:t>
+      </w:r>
+      <w:proofErr w:type="spellEnd"/>
+      <w:r>
+        <w:rPr>
+          <w:i/>
+          <w:iCs/>
+        </w:rPr>
+        <w:t xml:space="preserve"> </w:t>
+      </w:r>
+      <w:proofErr w:type="spellStart"/>
+      <w:r>
+        <w:rPr>
+          <w:i/>
+          <w:iCs/>
+        </w:rPr>
+        <w:t>udaata</w:t>
+      </w:r>
+      <w:proofErr w:type="spellEnd"/>
+      <w:r>
+        <w:rPr>
+          <w:i/>
+          <w:iCs/>
+        </w:rPr>
+        <w:t xml:space="preserve"> </w:t>
+      </w:r>
+      <w:proofErr w:type="spellStart"/>
+      <w:r>
+        <w:rPr>
+          <w:i/>
+          <w:iCs/>
+        </w:rPr>
+        <w:t>chala</w:t>
+      </w:r>
+      <w:proofErr w:type="spellEnd"/>
+      <w:r>
+        <w:rPr>
+          <w:i/>
+          <w:iCs/>
+        </w:rPr>
+        <w:t xml:space="preserve"> </w:t>
+      </w:r>
+      <w:proofErr w:type="spellStart"/>
+      <w:r>
+        <w:rPr>
+          <w:i/>
+          <w:iCs/>
+        </w:rPr>
+        <w:t>gaya</w:t>
+      </w:r>
+      <w:proofErr w:type="spellEnd"/>
+      <w:r>
+        <w:rPr>
+          <w:i/>
+          <w:iCs/>
+        </w:rPr>
+        <w:t xml:space="preserve">, </w:t>
+      </w:r>
+    </w:p>
+    <w:p>
+      <w:pPr>
+        <w:pStyle w:val="Redemphasis"/>
+        <w:rPr>
+          <w:i/>
+          <w:iCs/>
+        </w:rPr>
+      </w:pPr>
+      <w:r>
+        <w:rPr>
+          <w:i/>
+          <w:iCs/>
+        </w:rPr>
+        <w:t xml:space="preserve">Fikr </w:t>
+      </w:r>
+      <w:proofErr w:type="spellStart"/>
+      <w:r>
+        <w:rPr>
+          <w:i/>
+          <w:iCs/>
+        </w:rPr>
+        <w:t>toh</w:t>
+      </w:r>
+      <w:proofErr w:type="spellEnd"/>
+      <w:r>
+        <w:rPr>
+          <w:i/>
+          <w:iCs/>
+        </w:rPr>
+        <w:t xml:space="preserve"> meri </w:t>
+      </w:r>
+      <w:proofErr w:type="spellStart"/>
+      <w:r>
+        <w:rPr>
+          <w:i/>
+          <w:iCs/>
+        </w:rPr>
+        <w:t>thi</w:t>
+      </w:r>
+      <w:proofErr w:type="spellEnd"/>
+      <w:r>
+        <w:rPr>
+          <w:i/>
+          <w:iCs/>
+        </w:rPr>
+        <w:t xml:space="preserve"> </w:t>
+      </w:r>
+      <w:proofErr w:type="spellStart"/>
+      <w:r>
+        <w:rPr>
+          <w:i/>
+          <w:iCs/>
+        </w:rPr>
+        <w:t>magar</w:t>
+      </w:r>
+      <w:proofErr w:type="spellEnd"/>
+      <w:r>
+        <w:rPr>
+          <w:i/>
+          <w:iCs/>
+        </w:rPr>
+        <w:t xml:space="preserve">, </w:t>
+      </w:r>
+      <w:proofErr w:type="spellStart"/>
+      <w:r>
+        <w:rPr>
+          <w:i/>
+          <w:iCs/>
+        </w:rPr>
+        <w:t>dhuan</w:t>
+      </w:r>
+      <w:proofErr w:type="spellEnd"/>
+      <w:r>
+        <w:rPr>
+          <w:i/>
+          <w:iCs/>
+        </w:rPr>
+        <w:t xml:space="preserve"> </w:t>
+      </w:r>
+      <w:proofErr w:type="spellStart"/>
+      <w:r>
+        <w:rPr>
+          <w:i/>
+          <w:iCs/>
+        </w:rPr>
+        <w:t>doosre</w:t>
+      </w:r>
+      <w:proofErr w:type="spellEnd"/>
+      <w:r>
+        <w:rPr>
+          <w:i/>
+          <w:iCs/>
+        </w:rPr>
+        <w:t xml:space="preserve"> </w:t>
+      </w:r>
+      <w:proofErr w:type="spellStart"/>
+      <w:r>
+        <w:rPr>
+          <w:i/>
+          <w:iCs/>
+        </w:rPr>
+        <w:t>ke</w:t>
+      </w:r>
+      <w:proofErr w:type="spellEnd"/>
+      <w:r>
+        <w:rPr>
+          <w:i/>
+          <w:iCs/>
+        </w:rPr>
+        <w:t xml:space="preserve"> </w:t>
+      </w:r>
+      <w:proofErr w:type="spellStart"/>
+      <w:r>
+        <w:rPr>
+          <w:i/>
+          <w:iCs/>
+        </w:rPr>
+        <w:t>aangan</w:t>
+      </w:r>
+      <w:proofErr w:type="spellEnd"/>
+      <w:r>
+        <w:rPr>
+          <w:i/>
+          <w:iCs/>
+        </w:rPr>
+        <w:t xml:space="preserve"> </w:t>
+      </w:r>
+      <w:proofErr w:type="spellStart"/>
+      <w:r>
+        <w:rPr>
+          <w:i/>
+          <w:iCs/>
+        </w:rPr>
+        <w:t>mein</w:t>
+      </w:r>
+      <w:proofErr w:type="spellEnd"/>
+      <w:r>
+        <w:rPr>
+          <w:i/>
+          <w:iCs/>
+        </w:rPr>
+        <w:t xml:space="preserve"> </w:t>
+      </w:r>
+      <w:proofErr w:type="spellStart"/>
+      <w:r>
+        <w:rPr>
+          <w:i/>
+          <w:iCs/>
+        </w:rPr>
+        <w:t>udaata</w:t>
+      </w:r>
+      <w:proofErr w:type="spellEnd"/>
+      <w:r>
+        <w:rPr>
+          <w:i/>
+          <w:iCs/>
+        </w:rPr>
+        <w:t xml:space="preserve"> </w:t>
+      </w:r>
+      <w:proofErr w:type="spellStart"/>
+      <w:r>
+        <w:rPr>
+          <w:i/>
+          <w:iCs/>
+        </w:rPr>
+        <w:t>chala</w:t>
+      </w:r>
+      <w:proofErr w:type="spellEnd"/>
+      <w:r>
+        <w:rPr>
+          <w:i/>
+          <w:iCs/>
+        </w:rPr>
+        <w:t xml:space="preserve"> </w:t>
+      </w:r>
+      <w:proofErr w:type="spellStart"/>
+      <w:r>
+        <w:rPr>
+          <w:i/>
+          <w:iCs/>
+        </w:rPr>
+        <w:t>gaya</w:t>
+      </w:r>
+      <w:proofErr w:type="spellEnd"/>
+      <w:r>
+        <w:rPr>
+          <w:i/>
+          <w:iCs/>
+        </w:rPr>
+        <w:t>.”</w:t>
+      </w:r>
+    </w:p>
+    <w:p>
+      <w:pPr>
         <w:spacing w:before="240" w:after="240" w:line="120" w:lineRule="auto"/>
         <w:rPr>
           <w:i/>
           <w:iCs/>
         </w:rPr>
       </w:pPr>
-      <w:r>
-        <w:rPr>
-          <w:i/>
-          <w:iCs/>
-        </w:rPr>
-        <w:t xml:space="preserve">“Main </w:t>
-      </w:r>
-      <w:proofErr w:type="spellStart"/>
-      <w:r>
-        <w:rPr>
-          <w:i/>
-          <w:iCs/>
-        </w:rPr>
-        <w:t>zindagi</w:t>
-      </w:r>
-      <w:proofErr w:type="spellEnd"/>
-      <w:r>
-        <w:rPr>
-          <w:i/>
-          <w:iCs/>
-        </w:rPr>
-        <w:t xml:space="preserve"> ka </w:t>
-      </w:r>
-      <w:proofErr w:type="spellStart"/>
-      <w:r>
-        <w:rPr>
-          <w:i/>
-          <w:iCs/>
-        </w:rPr>
-        <w:t>saath</w:t>
-      </w:r>
-      <w:proofErr w:type="spellEnd"/>
-      <w:r>
-        <w:rPr>
-          <w:i/>
-          <w:iCs/>
-        </w:rPr>
-        <w:t xml:space="preserve"> </w:t>
-      </w:r>
-      <w:proofErr w:type="spellStart"/>
-      <w:r>
-        <w:rPr>
-          <w:i/>
-          <w:iCs/>
-        </w:rPr>
-        <w:t>nibhata</w:t>
-      </w:r>
-      <w:proofErr w:type="spellEnd"/>
-      <w:r>
-        <w:rPr>
-          <w:i/>
-          <w:iCs/>
-        </w:rPr>
-        <w:t xml:space="preserve"> </w:t>
-      </w:r>
-      <w:proofErr w:type="spellStart"/>
-      <w:r>
-        <w:rPr>
-          <w:i/>
-          <w:iCs/>
-        </w:rPr>
-        <w:t>chala</w:t>
-      </w:r>
-      <w:proofErr w:type="spellEnd"/>
-      <w:r>
-        <w:rPr>
-          <w:i/>
-          <w:iCs/>
-        </w:rPr>
-        <w:t xml:space="preserve"> </w:t>
-      </w:r>
-      <w:proofErr w:type="spellStart"/>
-      <w:r>
-        <w:rPr>
-          <w:i/>
-          <w:iCs/>
-        </w:rPr>
-        <w:t>gaya</w:t>
-      </w:r>
-      <w:proofErr w:type="spellEnd"/>
-      <w:r>
-        <w:rPr>
-          <w:i/>
-          <w:iCs/>
-        </w:rPr>
-        <w:t xml:space="preserve">, </w:t>
-      </w:r>
     </w:p>
     <w:p>
       <w:pPr>
         <w:spacing w:before="240" w:after="240" w:line="120" w:lineRule="auto"/>
-        <w:rPr>
-          <w:i/>
-          <w:iCs/>
-        </w:rPr>
-      </w:pPr>
-      <w:r>
-        <w:rPr>
-          <w:i/>
-          <w:iCs/>
-        </w:rPr>
-        <w:t xml:space="preserve">Har </w:t>
-      </w:r>
-      <w:proofErr w:type="spellStart"/>
-      <w:r>
-        <w:rPr>
-          <w:i/>
-          <w:iCs/>
-        </w:rPr>
-        <w:t>fikr</w:t>
-      </w:r>
-      <w:proofErr w:type="spellEnd"/>
-      <w:r>
-        <w:rPr>
-          <w:i/>
-          <w:iCs/>
-        </w:rPr>
-        <w:t xml:space="preserve"> ko </w:t>
-      </w:r>
-      <w:proofErr w:type="spellStart"/>
-      <w:r>
-        <w:rPr>
-          <w:i/>
-          <w:iCs/>
-        </w:rPr>
-        <w:t>dhuen</w:t>
-      </w:r>
-      <w:proofErr w:type="spellEnd"/>
-      <w:r>
-        <w:rPr>
-          <w:i/>
-          <w:iCs/>
-        </w:rPr>
-        <w:t xml:space="preserve"> </w:t>
-      </w:r>
-      <w:proofErr w:type="spellStart"/>
-      <w:r>
-        <w:rPr>
-          <w:i/>
-          <w:iCs/>
-        </w:rPr>
-        <w:t>mein</w:t>
-      </w:r>
-      <w:proofErr w:type="spellEnd"/>
-      <w:r>
-        <w:rPr>
-          <w:i/>
-          <w:iCs/>
-        </w:rPr>
-        <w:t xml:space="preserve"> </w:t>
-      </w:r>
-      <w:proofErr w:type="spellStart"/>
-      <w:r>
-        <w:rPr>
-          <w:i/>
-          <w:iCs/>
-        </w:rPr>
-        <w:t>udaata</w:t>
-      </w:r>
-      <w:proofErr w:type="spellEnd"/>
-      <w:r>
-        <w:rPr>
-          <w:i/>
-          <w:iCs/>
-        </w:rPr>
-        <w:t xml:space="preserve"> </w:t>
-      </w:r>
-      <w:proofErr w:type="spellStart"/>
-      <w:r>
-        <w:rPr>
-          <w:i/>
-          <w:iCs/>
-        </w:rPr>
-        <w:t>chala</w:t>
-      </w:r>
-      <w:proofErr w:type="spellEnd"/>
-      <w:r>
-        <w:rPr>
-          <w:i/>
-          <w:iCs/>
-        </w:rPr>
-        <w:t xml:space="preserve"> </w:t>
-      </w:r>
-      <w:proofErr w:type="spellStart"/>
-      <w:r>
-        <w:rPr>
-          <w:i/>
-          <w:iCs/>
-        </w:rPr>
-        <w:t>gaya</w:t>
-      </w:r>
-      <w:proofErr w:type="spellEnd"/>
-      <w:r>
-        <w:rPr>
-          <w:i/>
-          <w:iCs/>
-        </w:rPr>
-        <w:t xml:space="preserve">, </w:t>
-      </w:r>
-    </w:p>
-    <w:p>
-      <w:pPr>
-        <w:spacing w:before="240" w:after="240" w:line="120" w:lineRule="auto"/>
-        <w:rPr>
-          <w:i/>
-          <w:iCs/>
-        </w:rPr>
-      </w:pPr>
-      <w:r>
-        <w:rPr>
-          <w:i/>
-          <w:iCs/>
-          <w:color w:val="FF0000"/>
-        </w:rPr>
-        <w:t xml:space="preserve">Fikr </w:t>
-      </w:r>
-      <w:proofErr w:type="spellStart"/>
-      <w:r>
-        <w:rPr>
-          <w:i/>
-          <w:iCs/>
-          <w:color w:val="FF0000"/>
-        </w:rPr>
-        <w:t>toh</w:t>
-      </w:r>
-      <w:proofErr w:type="spellEnd"/>
-      <w:r>
-        <w:rPr>
-          <w:i/>
-          <w:iCs/>
-          <w:color w:val="FF0000"/>
-        </w:rPr>
-        <w:t xml:space="preserve"> meri </w:t>
-      </w:r>
-      <w:proofErr w:type="spellStart"/>
-      <w:r>
-        <w:rPr>
-          <w:i/>
-          <w:iCs/>
-          <w:color w:val="FF0000"/>
-        </w:rPr>
-        <w:t>thi</w:t>
-      </w:r>
-      <w:proofErr w:type="spellEnd"/>
-      <w:r>
-        <w:rPr>
-          <w:i/>
-          <w:iCs/>
-          <w:color w:val="FF0000"/>
-        </w:rPr>
-        <w:t xml:space="preserve"> </w:t>
-      </w:r>
-      <w:proofErr w:type="spellStart"/>
-      <w:r>
-        <w:rPr>
-          <w:i/>
-          <w:iCs/>
-          <w:color w:val="FF0000"/>
-        </w:rPr>
-        <w:t>magar</w:t>
-      </w:r>
-      <w:proofErr w:type="spellEnd"/>
-      <w:r>
-        <w:rPr>
-          <w:i/>
-          <w:iCs/>
-          <w:color w:val="FF0000"/>
-        </w:rPr>
-        <w:t xml:space="preserve">, </w:t>
-      </w:r>
-      <w:proofErr w:type="spellStart"/>
-      <w:r>
-        <w:rPr>
-          <w:i/>
-          <w:iCs/>
-          <w:color w:val="FF0000"/>
-        </w:rPr>
-        <w:t>dhuan</w:t>
-      </w:r>
-      <w:proofErr w:type="spellEnd"/>
-      <w:r>
-        <w:rPr>
-          <w:i/>
-          <w:iCs/>
-          <w:color w:val="FF0000"/>
-        </w:rPr>
-        <w:t xml:space="preserve"> </w:t>
-      </w:r>
-      <w:proofErr w:type="spellStart"/>
-      <w:r>
-        <w:rPr>
-          <w:i/>
-          <w:iCs/>
-          <w:color w:val="FF0000"/>
-        </w:rPr>
-        <w:t>doosre</w:t>
-      </w:r>
-      <w:proofErr w:type="spellEnd"/>
-      <w:r>
-        <w:rPr>
-          <w:i/>
-          <w:iCs/>
-          <w:color w:val="FF0000"/>
-        </w:rPr>
-        <w:t xml:space="preserve"> </w:t>
-      </w:r>
-      <w:proofErr w:type="spellStart"/>
-      <w:r>
-        <w:rPr>
-          <w:i/>
-          <w:iCs/>
-          <w:color w:val="FF0000"/>
-        </w:rPr>
-        <w:t>ke</w:t>
-      </w:r>
-      <w:proofErr w:type="spellEnd"/>
-      <w:r>
-        <w:rPr>
-          <w:i/>
-          <w:iCs/>
-          <w:color w:val="FF0000"/>
-        </w:rPr>
-        <w:t xml:space="preserve"> </w:t>
-      </w:r>
-      <w:proofErr w:type="spellStart"/>
-      <w:r>
-        <w:rPr>
-          <w:i/>
-          <w:iCs/>
-          <w:color w:val="FF0000"/>
-        </w:rPr>
-        <w:t>aangan</w:t>
-      </w:r>
-      <w:proofErr w:type="spellEnd"/>
-      <w:r>
-        <w:rPr>
-          <w:i/>
-          <w:iCs/>
-          <w:color w:val="FF0000"/>
-        </w:rPr>
-        <w:t xml:space="preserve"> </w:t>
-      </w:r>
-      <w:proofErr w:type="spellStart"/>
-      <w:r>
-        <w:rPr>
-          <w:i/>
-          <w:iCs/>
-          <w:color w:val="FF0000"/>
-        </w:rPr>
-        <w:t>mein</w:t>
-      </w:r>
-      <w:proofErr w:type="spellEnd"/>
-      <w:r>
-        <w:rPr>
-          <w:i/>
-          <w:iCs/>
-          <w:color w:val="FF0000"/>
-        </w:rPr>
-        <w:t xml:space="preserve"> </w:t>
-      </w:r>
-      <w:proofErr w:type="spellStart"/>
-      <w:r>
-        <w:rPr>
-          <w:i/>
-          <w:iCs/>
-          <w:color w:val="FF0000"/>
-        </w:rPr>
-        <w:t>udaata</w:t>
-      </w:r>
-      <w:proofErr w:type="spellEnd"/>
-      <w:r>
-        <w:rPr>
-          <w:i/>
-          <w:iCs/>
-          <w:color w:val="FF0000"/>
-        </w:rPr>
-        <w:t xml:space="preserve"> </w:t>
-      </w:r>
-      <w:proofErr w:type="spellStart"/>
-      <w:r>
-        <w:rPr>
-          <w:i/>
-          <w:iCs/>
-          <w:color w:val="FF0000"/>
-        </w:rPr>
-        <w:t>chala</w:t>
-      </w:r>
-      <w:proofErr w:type="spellEnd"/>
-      <w:r>
-        <w:rPr>
-          <w:i/>
-          <w:iCs/>
-          <w:color w:val="FF0000"/>
-        </w:rPr>
-        <w:t xml:space="preserve"> </w:t>
-      </w:r>
-      <w:proofErr w:type="spellStart"/>
-      <w:r>
-        <w:rPr>
-          <w:i/>
-          <w:iCs/>
-          <w:color w:val="FF0000"/>
-        </w:rPr>
-        <w:t>gaya</w:t>
-      </w:r>
-      <w:proofErr w:type="spellEnd"/>
-      <w:r>
-        <w:rPr>
-          <w:i/>
-          <w:iCs/>
-        </w:rPr>
-        <w:t>.”</w:t>
-      </w:r>
-    </w:p>
-    <w:p>
-      <w:pPr>
-        <w:spacing w:before="240" w:after="240" w:line="120" w:lineRule="auto"/>
-        <w:rPr>
-          <w:i/>
-          <w:iCs/>
-        </w:rPr>
-      </w:pPr>
-    </w:p>
-    <w:p>
-      <w:pPr>
-        <w:spacing w:before="240" w:after="240" w:line="120" w:lineRule="auto"/>
       </w:pPr>
       <w:r>
         <w:t>Translation:</w:t>
@@ -777,7 +766,6 @@
     </w:p>
     <w:p>
       <w:pPr>
-        <w:spacing w:before="240" w:after="240" w:line="120" w:lineRule="auto"/>
         <w:rPr>
           <w:i/>
           <w:iCs/>
@@ -793,7 +781,6 @@
     </w:p>
     <w:p>
       <w:pPr>
-        <w:spacing w:before="240" w:after="240" w:line="120" w:lineRule="auto"/>
         <w:rPr>
           <w:i/>
           <w:iCs/>
@@ -809,20 +796,17 @@
     </w:p>
     <w:p>
       <w:pPr>
-        <w:spacing w:before="240" w:after="240" w:line="120" w:lineRule="auto"/>
-        <w:rPr>
-          <w:i/>
-          <w:iCs/>
-          <w:color w:val="FF0000"/>
-        </w:rPr>
-      </w:pPr>
-      <w:r>
-        <w:rPr>
-          <w:i/>
-          <w:iCs/>
-          <w:color w:val="FF0000"/>
-        </w:rPr>
-        <w:t xml:space="preserve">The worry was mine, but the smoke in others' gaze.” </w:t>
+        <w:pStyle w:val="Redemphasis"/>
+      </w:pPr>
+      <w:r>
+        <w:rPr>
+          <w:i/>
+          <w:iCs/>
+        </w:rPr>
+        <w:t>The worry was mine, but the smoke in others' gaze</w:t>
+      </w:r>
+      <w:r>
+        <w:t xml:space="preserve">.” </w:t>
       </w:r>
     </w:p>
     <w:p>
@@ -888,6 +872,7 @@
     </w:p>
     <w:p>
       <w:r>
+        <w:lastRenderedPageBreak/>
         <w:t>Economists call this missing piece behind the overproduction the marginal external damage (MED). Add MPC and MED, and you get the marginal social cost (MSC):</w:t>
       </w:r>
     </w:p>
@@ -907,7 +892,6 @@
     <w:p/>
     <w:p>
       <w:r>
-        <w:lastRenderedPageBreak/>
         <w:t>Without intervention, the factory produces where Price = MPC, leading to overproduction relative to the socially optimal level where Price = MSC. This is exactly the logic behind a Pigouvian tax: a levy equal to MED per unit of pollution.</w:t>
       </w:r>
     </w:p>
@@ -1098,6 +1082,7 @@
           <w:b/>
           <w:bCs/>
         </w:rPr>
+        <w:lastRenderedPageBreak/>
         <w:t>Per-capita dividend</w:t>
       </w:r>
       <w:r>
@@ -1117,7 +1102,6 @@
           <w:b/>
           <w:bCs/>
         </w:rPr>
-        <w:lastRenderedPageBreak/>
         <w:t>Targeted transfers</w:t>
       </w:r>
       <w:r>
@@ -1225,9 +1209,10 @@
     </w:p>
     <w:p>
       <w:pPr>
+        <w:pStyle w:val="ListParagraph"/>
         <w:numPr>
           <w:ilvl w:val="0"/>
-          <w:numId w:val="3"/>
+          <w:numId w:val="8"/>
         </w:numPr>
         <w:spacing w:before="240" w:after="240"/>
       </w:pPr>
@@ -1256,8 +1241,14 @@
     </w:p>
     <w:p>
       <w:pPr>
-        <w:spacing w:before="240" w:after="240"/>
-        <w:ind w:left="720"/>
+        <w:pStyle w:val="ListParagraph"/>
+        <w:spacing w:before="240" w:after="240"/>
+      </w:pPr>
+    </w:p>
+    <w:p>
+      <w:pPr>
+        <w:pStyle w:val="ListParagraph"/>
+        <w:spacing w:before="240" w:after="240"/>
       </w:pPr>
       <w:r>
         <w:t xml:space="preserve">However, it is worth pointing out that this works best for </w:t>
@@ -1285,8 +1276,14 @@
     </w:p>
     <w:p>
       <w:pPr>
-        <w:spacing w:before="240" w:after="240"/>
-        <w:ind w:left="720"/>
+        <w:pStyle w:val="ListParagraph"/>
+        <w:spacing w:before="240" w:after="240"/>
+      </w:pPr>
+    </w:p>
+    <w:p>
+      <w:pPr>
+        <w:pStyle w:val="ListParagraph"/>
+        <w:spacing w:before="240" w:after="240"/>
       </w:pPr>
       <w:r>
         <w:t xml:space="preserve">But even then, there’s another kerfuffle: if BCAs only apply to a narrow set of sectors, emissions may simply shift to downstream industries that use the taxed inputs but are themselves exempt. In other words, unless the BCA’s coverage is broad enough to include major downstream users, the pollution doesn’t disappear but just moves along the value chain. So yes, we need </w:t>
@@ -1314,8 +1311,14 @@
     </w:p>
     <w:p>
       <w:pPr>
-        <w:spacing w:before="240" w:after="240"/>
-        <w:ind w:left="720"/>
+        <w:pStyle w:val="ListParagraph"/>
+        <w:spacing w:before="240" w:after="240"/>
+      </w:pPr>
+    </w:p>
+    <w:p>
+      <w:pPr>
+        <w:pStyle w:val="ListParagraph"/>
+        <w:spacing w:before="240" w:after="240"/>
       </w:pPr>
       <w:r>
         <w:t xml:space="preserve">For the nerds amongst us, </w:t>
@@ -1335,9 +1338,16 @@
     </w:p>
     <w:p>
       <w:pPr>
+        <w:pStyle w:val="ListParagraph"/>
+        <w:spacing w:before="240" w:after="240"/>
+      </w:pPr>
+    </w:p>
+    <w:p>
+      <w:pPr>
+        <w:pStyle w:val="ListParagraph"/>
         <w:numPr>
           <w:ilvl w:val="0"/>
-          <w:numId w:val="3"/>
+          <w:numId w:val="8"/>
         </w:numPr>
         <w:spacing w:before="240" w:after="240"/>
       </w:pPr>
@@ -1346,6 +1356,7 @@
           <w:b/>
           <w:bCs/>
         </w:rPr>
+        <w:lastRenderedPageBreak/>
         <w:t>Phase-in schedules</w:t>
       </w:r>
       <w:r>
@@ -1361,7 +1372,6 @@
         </w:rPr>
       </w:pPr>
       <w:r>
-        <w:lastRenderedPageBreak/>
         <w:t>In all cases, the market signal (the price of carbon) remains clear. Pollution is costly, innovation is incentivized, and overall efficiency rises. Seems like God’s hands at work; OR did someone whisper “</w:t>
       </w:r>
       <w:r>
@@ -1569,7 +1579,13 @@
       <w:bookmarkStart w:id="7" w:name="_v9t5l9dr2j6g" w:colFirst="0" w:colLast="0"/>
       <w:bookmarkEnd w:id="7"/>
       <w:r>
-        <w:t>Conclusion: A Libertarian First Love</w:t>
+        <w:t xml:space="preserve">Conclusion: A Libertarian </w:t>
+      </w:r>
+      <w:r>
+        <w:t>Secret</w:t>
+      </w:r>
+      <w:r>
+        <w:t xml:space="preserve"> Love</w:t>
       </w:r>
     </w:p>
     <w:p>
@@ -1589,6 +1605,7 @@
         <w:spacing w:before="240"/>
       </w:pPr>
       <w:r>
+        <w:lastRenderedPageBreak/>
         <w:t>Prices harm rather than seize wealth</w:t>
       </w:r>
       <w:r>
@@ -1603,7 +1620,6 @@
         </w:numPr>
       </w:pPr>
       <w:r>
-        <w:lastRenderedPageBreak/>
         <w:t xml:space="preserve">Rewards </w:t>
       </w:r>
       <w:proofErr w:type="gramStart"/>
@@ -1778,6 +1794,92 @@
     </w:lvl>
   </w:abstractNum>
   <w:abstractNum w:abstractNumId="1" w15:restartNumberingAfterBreak="0">
+    <w:nsid w:val="0A312558"/>
+    <w:multiLevelType w:val="hybridMultilevel"/>
+    <w:tmpl w:val="D65E8DB4"/>
+    <w:lvl w:ilvl="0" w:tplc="0809000F">
+      <w:start w:val="1"/>
+      <w:numFmt w:val="decimal"/>
+      <w:lvlText w:val="%1."/>
+      <w:lvlJc w:val="left"/>
+      <w:pPr>
+        <w:ind w:left="720" w:hanging="360"/>
+      </w:pPr>
+    </w:lvl>
+    <w:lvl w:ilvl="1" w:tplc="08090019" w:tentative="1">
+      <w:start w:val="1"/>
+      <w:numFmt w:val="lowerLetter"/>
+      <w:lvlText w:val="%2."/>
+      <w:lvlJc w:val="left"/>
+      <w:pPr>
+        <w:ind w:left="1440" w:hanging="360"/>
+      </w:pPr>
+    </w:lvl>
+    <w:lvl w:ilvl="2" w:tplc="0809001B" w:tentative="1">
+      <w:start w:val="1"/>
+      <w:numFmt w:val="lowerRoman"/>
+      <w:lvlText w:val="%3."/>
+      <w:lvlJc w:val="right"/>
+      <w:pPr>
+        <w:ind w:left="2160" w:hanging="180"/>
+      </w:pPr>
+    </w:lvl>
+    <w:lvl w:ilvl="3" w:tplc="0809000F" w:tentative="1">
+      <w:start w:val="1"/>
+      <w:numFmt w:val="decimal"/>
+      <w:lvlText w:val="%4."/>
+      <w:lvlJc w:val="left"/>
+      <w:pPr>
+        <w:ind w:left="2880" w:hanging="360"/>
+      </w:pPr>
+    </w:lvl>
+    <w:lvl w:ilvl="4" w:tplc="08090019" w:tentative="1">
+      <w:start w:val="1"/>
+      <w:numFmt w:val="lowerLetter"/>
+      <w:lvlText w:val="%5."/>
+      <w:lvlJc w:val="left"/>
+      <w:pPr>
+        <w:ind w:left="3600" w:hanging="360"/>
+      </w:pPr>
+    </w:lvl>
+    <w:lvl w:ilvl="5" w:tplc="0809001B" w:tentative="1">
+      <w:start w:val="1"/>
+      <w:numFmt w:val="lowerRoman"/>
+      <w:lvlText w:val="%6."/>
+      <w:lvlJc w:val="right"/>
+      <w:pPr>
+        <w:ind w:left="4320" w:hanging="180"/>
+      </w:pPr>
+    </w:lvl>
+    <w:lvl w:ilvl="6" w:tplc="0809000F" w:tentative="1">
+      <w:start w:val="1"/>
+      <w:numFmt w:val="decimal"/>
+      <w:lvlText w:val="%7."/>
+      <w:lvlJc w:val="left"/>
+      <w:pPr>
+        <w:ind w:left="5040" w:hanging="360"/>
+      </w:pPr>
+    </w:lvl>
+    <w:lvl w:ilvl="7" w:tplc="08090019" w:tentative="1">
+      <w:start w:val="1"/>
+      <w:numFmt w:val="lowerLetter"/>
+      <w:lvlText w:val="%8."/>
+      <w:lvlJc w:val="left"/>
+      <w:pPr>
+        <w:ind w:left="5760" w:hanging="360"/>
+      </w:pPr>
+    </w:lvl>
+    <w:lvl w:ilvl="8" w:tplc="0809001B" w:tentative="1">
+      <w:start w:val="1"/>
+      <w:numFmt w:val="lowerRoman"/>
+      <w:lvlText w:val="%9."/>
+      <w:lvlJc w:val="right"/>
+      <w:pPr>
+        <w:ind w:left="6480" w:hanging="180"/>
+      </w:pPr>
+    </w:lvl>
+  </w:abstractNum>
+  <w:abstractNum w:abstractNumId="2" w15:restartNumberingAfterBreak="0">
     <w:nsid w:val="0B892C54"/>
     <w:multiLevelType w:val="multilevel"/>
     <w:tmpl w:val="C082E6B0"/>
@@ -1890,7 +1992,7 @@
       </w:rPr>
     </w:lvl>
   </w:abstractNum>
-  <w:abstractNum w:abstractNumId="2" w15:restartNumberingAfterBreak="0">
+  <w:abstractNum w:abstractNumId="3" w15:restartNumberingAfterBreak="0">
     <w:nsid w:val="1167463F"/>
     <w:multiLevelType w:val="multilevel"/>
     <w:tmpl w:val="39D62AC6"/>
@@ -2003,7 +2105,7 @@
       </w:rPr>
     </w:lvl>
   </w:abstractNum>
-  <w:abstractNum w:abstractNumId="3" w15:restartNumberingAfterBreak="0">
+  <w:abstractNum w:abstractNumId="4" w15:restartNumberingAfterBreak="0">
     <w:nsid w:val="239956B9"/>
     <w:multiLevelType w:val="multilevel"/>
     <w:tmpl w:val="75B65796"/>
@@ -2116,7 +2218,7 @@
       </w:rPr>
     </w:lvl>
   </w:abstractNum>
-  <w:abstractNum w:abstractNumId="4" w15:restartNumberingAfterBreak="0">
+  <w:abstractNum w:abstractNumId="5" w15:restartNumberingAfterBreak="0">
     <w:nsid w:val="32483D10"/>
     <w:multiLevelType w:val="multilevel"/>
     <w:tmpl w:val="94B0C8B2"/>
@@ -2229,7 +2331,93 @@
       </w:rPr>
     </w:lvl>
   </w:abstractNum>
-  <w:abstractNum w:abstractNumId="5" w15:restartNumberingAfterBreak="0">
+  <w:abstractNum w:abstractNumId="6" w15:restartNumberingAfterBreak="0">
+    <w:nsid w:val="43264CFB"/>
+    <w:multiLevelType w:val="hybridMultilevel"/>
+    <w:tmpl w:val="04AED13E"/>
+    <w:lvl w:ilvl="0" w:tplc="0809000F">
+      <w:start w:val="1"/>
+      <w:numFmt w:val="decimal"/>
+      <w:lvlText w:val="%1."/>
+      <w:lvlJc w:val="left"/>
+      <w:pPr>
+        <w:ind w:left="720" w:hanging="360"/>
+      </w:pPr>
+    </w:lvl>
+    <w:lvl w:ilvl="1" w:tplc="08090019">
+      <w:start w:val="1"/>
+      <w:numFmt w:val="lowerLetter"/>
+      <w:lvlText w:val="%2."/>
+      <w:lvlJc w:val="left"/>
+      <w:pPr>
+        <w:ind w:left="1440" w:hanging="360"/>
+      </w:pPr>
+    </w:lvl>
+    <w:lvl w:ilvl="2" w:tplc="0809001B" w:tentative="1">
+      <w:start w:val="1"/>
+      <w:numFmt w:val="lowerRoman"/>
+      <w:lvlText w:val="%3."/>
+      <w:lvlJc w:val="right"/>
+      <w:pPr>
+        <w:ind w:left="2160" w:hanging="180"/>
+      </w:pPr>
+    </w:lvl>
+    <w:lvl w:ilvl="3" w:tplc="0809000F" w:tentative="1">
+      <w:start w:val="1"/>
+      <w:numFmt w:val="decimal"/>
+      <w:lvlText w:val="%4."/>
+      <w:lvlJc w:val="left"/>
+      <w:pPr>
+        <w:ind w:left="2880" w:hanging="360"/>
+      </w:pPr>
+    </w:lvl>
+    <w:lvl w:ilvl="4" w:tplc="08090019" w:tentative="1">
+      <w:start w:val="1"/>
+      <w:numFmt w:val="lowerLetter"/>
+      <w:lvlText w:val="%5."/>
+      <w:lvlJc w:val="left"/>
+      <w:pPr>
+        <w:ind w:left="3600" w:hanging="360"/>
+      </w:pPr>
+    </w:lvl>
+    <w:lvl w:ilvl="5" w:tplc="0809001B" w:tentative="1">
+      <w:start w:val="1"/>
+      <w:numFmt w:val="lowerRoman"/>
+      <w:lvlText w:val="%6."/>
+      <w:lvlJc w:val="right"/>
+      <w:pPr>
+        <w:ind w:left="4320" w:hanging="180"/>
+      </w:pPr>
+    </w:lvl>
+    <w:lvl w:ilvl="6" w:tplc="0809000F" w:tentative="1">
+      <w:start w:val="1"/>
+      <w:numFmt w:val="decimal"/>
+      <w:lvlText w:val="%7."/>
+      <w:lvlJc w:val="left"/>
+      <w:pPr>
+        <w:ind w:left="5040" w:hanging="360"/>
+      </w:pPr>
+    </w:lvl>
+    <w:lvl w:ilvl="7" w:tplc="08090019" w:tentative="1">
+      <w:start w:val="1"/>
+      <w:numFmt w:val="lowerLetter"/>
+      <w:lvlText w:val="%8."/>
+      <w:lvlJc w:val="left"/>
+      <w:pPr>
+        <w:ind w:left="5760" w:hanging="360"/>
+      </w:pPr>
+    </w:lvl>
+    <w:lvl w:ilvl="8" w:tplc="0809001B" w:tentative="1">
+      <w:start w:val="1"/>
+      <w:numFmt w:val="lowerRoman"/>
+      <w:lvlText w:val="%9."/>
+      <w:lvlJc w:val="right"/>
+      <w:pPr>
+        <w:ind w:left="6480" w:hanging="180"/>
+      </w:pPr>
+    </w:lvl>
+  </w:abstractNum>
+  <w:abstractNum w:abstractNumId="7" w15:restartNumberingAfterBreak="0">
     <w:nsid w:val="73136CD8"/>
     <w:multiLevelType w:val="multilevel"/>
     <w:tmpl w:val="AC5CC6D0"/>
@@ -2343,22 +2531,28 @@
     </w:lvl>
   </w:abstractNum>
   <w:num w:numId="1" w16cid:durableId="442850449">
-    <w:abstractNumId w:val="3"/>
+    <w:abstractNumId w:val="4"/>
   </w:num>
   <w:num w:numId="2" w16cid:durableId="30426254">
-    <w:abstractNumId w:val="2"/>
+    <w:abstractNumId w:val="3"/>
   </w:num>
   <w:num w:numId="3" w16cid:durableId="1820999740">
     <w:abstractNumId w:val="0"/>
   </w:num>
   <w:num w:numId="4" w16cid:durableId="1534464438">
-    <w:abstractNumId w:val="1"/>
+    <w:abstractNumId w:val="2"/>
   </w:num>
   <w:num w:numId="5" w16cid:durableId="310210932">
+    <w:abstractNumId w:val="7"/>
+  </w:num>
+  <w:num w:numId="6" w16cid:durableId="1408915702">
     <w:abstractNumId w:val="5"/>
   </w:num>
-  <w:num w:numId="6" w16cid:durableId="1408915702">
-    <w:abstractNumId w:val="4"/>
+  <w:num w:numId="7" w16cid:durableId="432356777">
+    <w:abstractNumId w:val="6"/>
+  </w:num>
+  <w:num w:numId="8" w16cid:durableId="1440832991">
+    <w:abstractNumId w:val="1"/>
   </w:num>
 </w:numbering>
 </file>
@@ -2878,7 +3072,6 @@
   <w:style w:type="character" w:default="1" w:styleId="DefaultParagraphFont">
     <w:name w:val="Default Paragraph Font"/>
     <w:uiPriority w:val="1"/>
-    <w:semiHidden/>
     <w:unhideWhenUsed/>
   </w:style>
   <w:style w:type="table" w:default="1" w:styleId="TableNormal">
@@ -2981,6 +3174,30 @@
     <w:rPr>
       <w:sz w:val="16"/>
       <w:szCs w:val="16"/>
+    </w:rPr>
+  </w:style>
+  <w:style w:type="paragraph" w:styleId="ListParagraph">
+    <w:name w:val="List Paragraph"/>
+    <w:basedOn w:val="Normal"/>
+    <w:uiPriority w:val="34"/>
+    <w:qFormat/>
+    <w:rsid w:val="002F6B33"/>
+    <w:pPr>
+      <w:ind w:left="720"/>
+      <w:contextualSpacing/>
+    </w:pPr>
+  </w:style>
+  <w:style w:type="paragraph" w:customStyle="1" w:styleId="Redemphasis">
+    <w:name w:val="Red emphasis"/>
+    <w:basedOn w:val="Normal"/>
+    <w:qFormat/>
+    <w:rsid w:val="00215C72"/>
+    <w:pPr>
+      <w:spacing w:before="240" w:after="240"/>
+      <w:ind w:right="600"/>
+    </w:pPr>
+    <w:rPr>
+      <w:color w:val="EE0000"/>
     </w:rPr>
   </w:style>
 </w:styles>

</xml_diff>

<commit_message>
Update to V's article
</commit_message>
<xml_diff>
--- a/assets/Carbon Taxes A Libertarians Secret Love.docx
+++ b/assets/Carbon Taxes A Libertarians Secret Love.docx
@@ -1209,13 +1209,15 @@
     </w:p>
     <w:p>
       <w:pPr>
-        <w:pStyle w:val="ListParagraph"/>
-        <w:numPr>
-          <w:ilvl w:val="0"/>
-          <w:numId w:val="8"/>
-        </w:numPr>
         <w:spacing w:before="240" w:after="240"/>
       </w:pPr>
+      <w:r>
+        <w:rPr>
+          <w:b/>
+          <w:bCs/>
+        </w:rPr>
+        <w:t xml:space="preserve">1. </w:t>
+      </w:r>
       <w:r>
         <w:rPr>
           <w:b/>
@@ -1241,13 +1243,6 @@
     </w:p>
     <w:p>
       <w:pPr>
-        <w:pStyle w:val="ListParagraph"/>
-        <w:spacing w:before="240" w:after="240"/>
-      </w:pPr>
-    </w:p>
-    <w:p>
-      <w:pPr>
-        <w:pStyle w:val="ListParagraph"/>
         <w:spacing w:before="240" w:after="240"/>
       </w:pPr>
       <w:r>
@@ -1276,15 +1271,8 @@
     </w:p>
     <w:p>
       <w:pPr>
-        <w:pStyle w:val="ListParagraph"/>
         <w:spacing w:before="240" w:after="240"/>
       </w:pPr>
-    </w:p>
-    <w:p>
-      <w:pPr>
-        <w:pStyle w:val="ListParagraph"/>
-        <w:spacing w:before="240" w:after="240"/>
-      </w:pPr>
       <w:r>
         <w:t xml:space="preserve">But even then, there’s another kerfuffle: if BCAs only apply to a narrow set of sectors, emissions may simply shift to downstream industries that use the taxed inputs but are themselves exempt. In other words, unless the BCA’s coverage is broad enough to include major downstream users, the pollution doesn’t disappear but just moves along the value chain. So yes, we need </w:t>
       </w:r>
@@ -1311,13 +1299,6 @@
     </w:p>
     <w:p>
       <w:pPr>
-        <w:pStyle w:val="ListParagraph"/>
-        <w:spacing w:before="240" w:after="240"/>
-      </w:pPr>
-    </w:p>
-    <w:p>
-      <w:pPr>
-        <w:pStyle w:val="ListParagraph"/>
         <w:spacing w:before="240" w:after="240"/>
       </w:pPr>
       <w:r>
@@ -1338,17 +1319,6 @@
     </w:p>
     <w:p>
       <w:pPr>
-        <w:pStyle w:val="ListParagraph"/>
-        <w:spacing w:before="240" w:after="240"/>
-      </w:pPr>
-    </w:p>
-    <w:p>
-      <w:pPr>
-        <w:pStyle w:val="ListParagraph"/>
-        <w:numPr>
-          <w:ilvl w:val="0"/>
-          <w:numId w:val="8"/>
-        </w:numPr>
         <w:spacing w:before="240" w:after="240"/>
       </w:pPr>
       <w:r>
@@ -1356,22 +1326,29 @@
           <w:b/>
           <w:bCs/>
         </w:rPr>
+        <w:t xml:space="preserve">2. </w:t>
+      </w:r>
+      <w:r>
+        <w:rPr>
+          <w:b/>
+          <w:bCs/>
+        </w:rPr>
+        <w:t>Phase-in schedules</w:t>
+      </w:r>
+      <w:r>
+        <w:t xml:space="preserve">: High-emission industries adjust gradually; innovation is rewarded; employment shocks minimized. </w:t>
+      </w:r>
+    </w:p>
+    <w:p>
+      <w:pPr>
+        <w:spacing w:before="240" w:after="240"/>
+        <w:rPr>
+          <w:i/>
+          <w:iCs/>
+        </w:rPr>
+      </w:pPr>
+      <w:r>
         <w:lastRenderedPageBreak/>
-        <w:t>Phase-in schedules</w:t>
-      </w:r>
-      <w:r>
-        <w:t xml:space="preserve">: High-emission industries adjust gradually; innovation is rewarded; employment shocks minimized. </w:t>
-      </w:r>
-    </w:p>
-    <w:p>
-      <w:pPr>
-        <w:spacing w:before="240" w:after="240"/>
-        <w:rPr>
-          <w:i/>
-          <w:iCs/>
-        </w:rPr>
-      </w:pPr>
-      <w:r>
         <w:t>In all cases, the market signal (the price of carbon) remains clear. Pollution is costly, innovation is incentivized, and overall efficiency rises. Seems like God’s hands at work; OR did someone whisper “</w:t>
       </w:r>
       <w:r>
@@ -1605,7 +1582,6 @@
         <w:spacing w:before="240"/>
       </w:pPr>
       <w:r>
-        <w:lastRenderedPageBreak/>
         <w:t>Prices harm rather than seize wealth</w:t>
       </w:r>
       <w:r>
@@ -1620,6 +1596,7 @@
         </w:numPr>
       </w:pPr>
       <w:r>
+        <w:lastRenderedPageBreak/>
         <w:t xml:space="preserve">Rewards </w:t>
       </w:r>
       <w:proofErr w:type="gramStart"/>
@@ -3072,6 +3049,7 @@
   <w:style w:type="character" w:default="1" w:styleId="DefaultParagraphFont">
     <w:name w:val="Default Paragraph Font"/>
     <w:uiPriority w:val="1"/>
+    <w:semiHidden/>
     <w:unhideWhenUsed/>
   </w:style>
   <w:style w:type="table" w:default="1" w:styleId="TableNormal">

</xml_diff>